<commit_message>
Add White Art Gallery tour and graphics project materials
</commit_message>
<xml_diff>
--- a/re0/Docs/计划与分工/计算机图形学课程26年_孙含睿_B3民族建筑景区3DGS沉浸式导览与游览路线推荐系统_项目计划书.docx
+++ b/re0/Docs/计划与分工/计算机图形学课程26年_孙含睿_B3民族建筑景区3DGS沉浸式导览与游览路线推荐系统_项目计划书.docx
@@ -102,7 +102,6 @@
                 <w:rFonts w:hint="eastAsia"/>
               </w:rPr>
             </w:pPr>
-            <w:proofErr w:type="spellStart"/>
             <w:r>
               <w:rPr>
                 <w:rFonts w:ascii="微软雅黑" w:eastAsia="微软雅黑" w:hAnsi="微软雅黑"/>
@@ -112,7 +111,6 @@
               </w:rPr>
               <w:t>项目事项</w:t>
             </w:r>
-            <w:proofErr w:type="spellEnd"/>
           </w:p>
         </w:tc>
         <w:tc>
@@ -141,7 +139,6 @@
                 <w:rFonts w:hint="eastAsia"/>
               </w:rPr>
             </w:pPr>
-            <w:proofErr w:type="spellStart"/>
             <w:r>
               <w:rPr>
                 <w:rFonts w:ascii="微软雅黑" w:eastAsia="微软雅黑" w:hAnsi="微软雅黑"/>
@@ -151,7 +148,6 @@
               </w:rPr>
               <w:t>内容</w:t>
             </w:r>
-            <w:proofErr w:type="spellEnd"/>
           </w:p>
         </w:tc>
         <w:tc>
@@ -180,7 +176,6 @@
                 <w:rFonts w:hint="eastAsia"/>
               </w:rPr>
             </w:pPr>
-            <w:proofErr w:type="spellStart"/>
             <w:r>
               <w:rPr>
                 <w:rFonts w:ascii="微软雅黑" w:eastAsia="微软雅黑" w:hAnsi="微软雅黑"/>
@@ -190,7 +185,6 @@
               </w:rPr>
               <w:t>项目事项</w:t>
             </w:r>
-            <w:proofErr w:type="spellEnd"/>
           </w:p>
         </w:tc>
         <w:tc>
@@ -219,7 +213,6 @@
                 <w:rFonts w:hint="eastAsia"/>
               </w:rPr>
             </w:pPr>
-            <w:proofErr w:type="spellStart"/>
             <w:r>
               <w:rPr>
                 <w:rFonts w:ascii="微软雅黑" w:eastAsia="微软雅黑" w:hAnsi="微软雅黑"/>
@@ -229,7 +222,6 @@
               </w:rPr>
               <w:t>内容</w:t>
             </w:r>
-            <w:proofErr w:type="spellEnd"/>
           </w:p>
         </w:tc>
       </w:tr>
@@ -263,7 +255,6 @@
                 <w:rFonts w:hint="eastAsia"/>
               </w:rPr>
             </w:pPr>
-            <w:proofErr w:type="spellStart"/>
             <w:r>
               <w:rPr>
                 <w:rFonts w:eastAsia="宋体"/>
@@ -271,7 +262,6 @@
               </w:rPr>
               <w:t>指导教师</w:t>
             </w:r>
-            <w:proofErr w:type="spellEnd"/>
           </w:p>
         </w:tc>
         <w:tc>
@@ -298,7 +288,6 @@
                 <w:rFonts w:hint="eastAsia"/>
               </w:rPr>
             </w:pPr>
-            <w:proofErr w:type="spellStart"/>
             <w:r>
               <w:rPr>
                 <w:rFonts w:eastAsia="宋体"/>
@@ -306,7 +295,6 @@
               </w:rPr>
               <w:t>李奕君</w:t>
             </w:r>
-            <w:proofErr w:type="spellEnd"/>
           </w:p>
         </w:tc>
         <w:tc>
@@ -334,7 +322,6 @@
                 <w:rFonts w:hint="eastAsia"/>
               </w:rPr>
             </w:pPr>
-            <w:proofErr w:type="spellStart"/>
             <w:r>
               <w:rPr>
                 <w:rFonts w:eastAsia="宋体"/>
@@ -342,7 +329,6 @@
               </w:rPr>
               <w:t>小组人数</w:t>
             </w:r>
-            <w:proofErr w:type="spellEnd"/>
           </w:p>
         </w:tc>
         <w:tc>
@@ -410,7 +396,6 @@
                 <w:rFonts w:hint="eastAsia"/>
               </w:rPr>
             </w:pPr>
-            <w:proofErr w:type="spellStart"/>
             <w:r>
               <w:rPr>
                 <w:rFonts w:eastAsia="宋体"/>
@@ -418,7 +403,6 @@
               </w:rPr>
               <w:t>组长</w:t>
             </w:r>
-            <w:proofErr w:type="spellEnd"/>
           </w:p>
         </w:tc>
         <w:tc>
@@ -482,7 +466,6 @@
                 <w:rFonts w:hint="eastAsia"/>
               </w:rPr>
             </w:pPr>
-            <w:proofErr w:type="spellStart"/>
             <w:r>
               <w:rPr>
                 <w:rFonts w:eastAsia="宋体"/>
@@ -490,7 +473,6 @@
               </w:rPr>
               <w:t>计划周期</w:t>
             </w:r>
-            <w:proofErr w:type="spellEnd"/>
           </w:p>
         </w:tc>
         <w:tc>
@@ -558,21 +540,12 @@
                 <w:rFonts w:hint="eastAsia"/>
               </w:rPr>
             </w:pPr>
-            <w:proofErr w:type="spellStart"/>
             <w:r>
               <w:rPr>
                 <w:rFonts w:eastAsia="宋体"/>
                 <w:sz w:val="18"/>
               </w:rPr>
-              <w:t>成员</w:t>
-            </w:r>
-            <w:proofErr w:type="spellEnd"/>
-            <w:r>
-              <w:rPr>
-                <w:rFonts w:eastAsia="宋体"/>
-                <w:sz w:val="18"/>
-              </w:rPr>
-              <w:t xml:space="preserve"> A</w:t>
+              <w:t>成员 A</w:t>
             </w:r>
           </w:p>
         </w:tc>
@@ -635,21 +608,12 @@
                 <w:rFonts w:hint="eastAsia"/>
               </w:rPr>
             </w:pPr>
-            <w:proofErr w:type="spellStart"/>
             <w:r>
               <w:rPr>
                 <w:rFonts w:eastAsia="宋体"/>
                 <w:sz w:val="18"/>
               </w:rPr>
-              <w:t>成员</w:t>
-            </w:r>
-            <w:proofErr w:type="spellEnd"/>
-            <w:r>
-              <w:rPr>
-                <w:rFonts w:eastAsia="宋体"/>
-                <w:sz w:val="18"/>
-              </w:rPr>
-              <w:t xml:space="preserve"> B</w:t>
+              <w:t>成员 B</w:t>
             </w:r>
           </w:p>
         </w:tc>
@@ -720,21 +684,12 @@
                 <w:rFonts w:hint="eastAsia"/>
               </w:rPr>
             </w:pPr>
-            <w:proofErr w:type="spellStart"/>
             <w:r>
               <w:rPr>
                 <w:rFonts w:eastAsia="宋体"/>
                 <w:sz w:val="18"/>
               </w:rPr>
-              <w:t>成员</w:t>
-            </w:r>
-            <w:proofErr w:type="spellEnd"/>
-            <w:r>
-              <w:rPr>
-                <w:rFonts w:eastAsia="宋体"/>
-                <w:sz w:val="18"/>
-              </w:rPr>
-              <w:t xml:space="preserve"> C</w:t>
+              <w:t>成员 C</w:t>
             </w:r>
           </w:p>
         </w:tc>
@@ -835,7 +790,6 @@
                 <w:lang w:eastAsia="zh-CN"/>
               </w:rPr>
             </w:pPr>
-            <w:proofErr w:type="spellStart"/>
             <w:r>
               <w:rPr>
                 <w:rFonts w:eastAsia="宋体" w:hint="eastAsia"/>
@@ -844,7 +798,6 @@
               </w:rPr>
               <w:t>Sutherland_Mini</w:t>
             </w:r>
-            <w:proofErr w:type="spellEnd"/>
           </w:p>
         </w:tc>
       </w:tr>
@@ -867,17 +820,8 @@
           <w:rFonts w:ascii="微软雅黑" w:eastAsia="微软雅黑" w:hAnsi="微软雅黑"/>
           <w:sz w:val="26"/>
         </w:rPr>
-        <w:t xml:space="preserve">2 </w:t>
+        <w:t>2 项目概述</w:t>
       </w:r>
-      <w:proofErr w:type="spellStart"/>
-      <w:r>
-        <w:rPr>
-          <w:rFonts w:ascii="微软雅黑" w:eastAsia="微软雅黑" w:hAnsi="微软雅黑"/>
-          <w:sz w:val="26"/>
-        </w:rPr>
-        <w:t>项目概述</w:t>
-      </w:r>
-      <w:proofErr w:type="spellEnd"/>
     </w:p>
     <w:p>
       <w:pPr>
@@ -921,17 +865,8 @@
           <w:rFonts w:ascii="微软雅黑" w:eastAsia="微软雅黑" w:hAnsi="微软雅黑"/>
           <w:sz w:val="26"/>
         </w:rPr>
-        <w:t xml:space="preserve">3 </w:t>
+        <w:t>3 项目目标</w:t>
       </w:r>
-      <w:proofErr w:type="spellStart"/>
-      <w:r>
-        <w:rPr>
-          <w:rFonts w:ascii="微软雅黑" w:eastAsia="微软雅黑" w:hAnsi="微软雅黑"/>
-          <w:sz w:val="26"/>
-        </w:rPr>
-        <w:t>项目目标</w:t>
-      </w:r>
-      <w:proofErr w:type="spellEnd"/>
     </w:p>
     <w:tbl>
       <w:tblPr>
@@ -976,7 +911,6 @@
                 <w:rFonts w:hint="eastAsia"/>
               </w:rPr>
             </w:pPr>
-            <w:proofErr w:type="spellStart"/>
             <w:r>
               <w:rPr>
                 <w:rFonts w:ascii="微软雅黑" w:eastAsia="微软雅黑" w:hAnsi="微软雅黑"/>
@@ -986,7 +920,6 @@
               </w:rPr>
               <w:t>类别</w:t>
             </w:r>
-            <w:proofErr w:type="spellEnd"/>
           </w:p>
         </w:tc>
         <w:tc>
@@ -1015,7 +948,6 @@
                 <w:rFonts w:hint="eastAsia"/>
               </w:rPr>
             </w:pPr>
-            <w:proofErr w:type="spellStart"/>
             <w:r>
               <w:rPr>
                 <w:rFonts w:ascii="微软雅黑" w:eastAsia="微软雅黑" w:hAnsi="微软雅黑"/>
@@ -1025,7 +957,6 @@
               </w:rPr>
               <w:t>具体目标</w:t>
             </w:r>
-            <w:proofErr w:type="spellEnd"/>
           </w:p>
         </w:tc>
         <w:tc>
@@ -1054,7 +985,6 @@
                 <w:rFonts w:hint="eastAsia"/>
               </w:rPr>
             </w:pPr>
-            <w:proofErr w:type="spellStart"/>
             <w:r>
               <w:rPr>
                 <w:rFonts w:ascii="微软雅黑" w:eastAsia="微软雅黑" w:hAnsi="微软雅黑"/>
@@ -1064,7 +994,6 @@
               </w:rPr>
               <w:t>可检查的结果</w:t>
             </w:r>
-            <w:proofErr w:type="spellEnd"/>
           </w:p>
         </w:tc>
       </w:tr>
@@ -1098,7 +1027,6 @@
                 <w:rFonts w:hint="eastAsia"/>
               </w:rPr>
             </w:pPr>
-            <w:proofErr w:type="spellStart"/>
             <w:r>
               <w:rPr>
                 <w:rFonts w:eastAsia="宋体"/>
@@ -1106,7 +1034,6 @@
               </w:rPr>
               <w:t>技术目标</w:t>
             </w:r>
-            <w:proofErr w:type="spellEnd"/>
           </w:p>
         </w:tc>
         <w:tc>
@@ -1211,7 +1138,6 @@
                 <w:rFonts w:hint="eastAsia"/>
               </w:rPr>
             </w:pPr>
-            <w:proofErr w:type="spellStart"/>
             <w:r>
               <w:rPr>
                 <w:rFonts w:eastAsia="宋体"/>
@@ -1219,7 +1145,6 @@
               </w:rPr>
               <w:t>工程目标</w:t>
             </w:r>
-            <w:proofErr w:type="spellEnd"/>
           </w:p>
         </w:tc>
         <w:tc>
@@ -1325,7 +1250,6 @@
                 <w:rFonts w:hint="eastAsia"/>
               </w:rPr>
             </w:pPr>
-            <w:proofErr w:type="spellStart"/>
             <w:r>
               <w:rPr>
                 <w:rFonts w:eastAsia="宋体"/>
@@ -1333,7 +1257,6 @@
               </w:rPr>
               <w:t>研究目标</w:t>
             </w:r>
-            <w:proofErr w:type="spellEnd"/>
           </w:p>
         </w:tc>
         <w:tc>
@@ -1420,7 +1343,7 @@
     <w:p>
       <w:pPr>
         <w:rPr>
-          <w:rFonts w:eastAsia="宋体"/>
+          <w:rFonts w:eastAsia="宋体" w:hint="eastAsia"/>
           <w:lang w:eastAsia="zh-CN"/>
         </w:rPr>
       </w:pPr>
@@ -1435,7 +1358,7 @@
     <w:p>
       <w:pPr>
         <w:rPr>
-          <w:rFonts w:eastAsia="宋体"/>
+          <w:rFonts w:eastAsia="宋体" w:hint="eastAsia"/>
           <w:lang w:eastAsia="zh-CN"/>
         </w:rPr>
       </w:pPr>
@@ -1445,7 +1368,7 @@
         <w:pStyle w:val="1"/>
         <w:spacing w:before="260" w:after="120"/>
         <w:rPr>
-          <w:rFonts w:ascii="微软雅黑" w:eastAsia="微软雅黑" w:hAnsi="微软雅黑"/>
+          <w:rFonts w:ascii="微软雅黑" w:eastAsia="微软雅黑" w:hAnsi="微软雅黑" w:hint="eastAsia"/>
           <w:sz w:val="26"/>
           <w:lang w:eastAsia="zh-CN"/>
         </w:rPr>
@@ -1476,7 +1399,7 @@
           <w:numId w:val="10"/>
         </w:numPr>
         <w:rPr>
-          <w:rFonts w:eastAsia="宋体"/>
+          <w:rFonts w:eastAsia="宋体" w:hint="eastAsia"/>
           <w:lang w:eastAsia="zh-CN"/>
         </w:rPr>
       </w:pPr>
@@ -1523,7 +1446,7 @@
           <w:numId w:val="10"/>
         </w:numPr>
         <w:rPr>
-          <w:rFonts w:eastAsia="宋体"/>
+          <w:rFonts w:eastAsia="宋体" w:hint="eastAsia"/>
           <w:lang w:eastAsia="zh-CN"/>
         </w:rPr>
       </w:pPr>
@@ -1552,7 +1475,7 @@
           <w:numId w:val="10"/>
         </w:numPr>
         <w:rPr>
-          <w:rFonts w:eastAsia="宋体"/>
+          <w:rFonts w:eastAsia="宋体" w:hint="eastAsia"/>
           <w:lang w:eastAsia="zh-CN"/>
         </w:rPr>
       </w:pPr>
@@ -1581,7 +1504,7 @@
           <w:numId w:val="10"/>
         </w:numPr>
         <w:rPr>
-          <w:rFonts w:eastAsia="宋体"/>
+          <w:rFonts w:eastAsia="宋体" w:hint="eastAsia"/>
           <w:lang w:eastAsia="zh-CN"/>
         </w:rPr>
       </w:pPr>
@@ -1666,11 +1589,19 @@
       </w:pPr>
       <w:r>
         <w:rPr>
+          <w:rFonts w:ascii="微软雅黑" w:eastAsia="微软雅黑" w:hAnsi="微软雅黑" w:hint="eastAsia"/>
+          <w:sz w:val="22"/>
+          <w:lang w:eastAsia="zh-CN"/>
+        </w:rPr>
+        <w:t>5</w:t>
+      </w:r>
+      <w:r>
+        <w:rPr>
           <w:rFonts w:ascii="微软雅黑" w:eastAsia="微软雅黑" w:hAnsi="微软雅黑"/>
           <w:sz w:val="22"/>
           <w:lang w:eastAsia="zh-CN"/>
         </w:rPr>
-        <w:t>4.1 分阶段实现</w:t>
+        <w:t>.1 分阶段实现</w:t>
       </w:r>
     </w:p>
     <w:tbl>
@@ -1716,7 +1647,6 @@
                 <w:rFonts w:hint="eastAsia"/>
               </w:rPr>
             </w:pPr>
-            <w:proofErr w:type="spellStart"/>
             <w:r>
               <w:rPr>
                 <w:rFonts w:ascii="微软雅黑" w:eastAsia="微软雅黑" w:hAnsi="微软雅黑"/>
@@ -1726,7 +1656,6 @@
               </w:rPr>
               <w:t>步骤</w:t>
             </w:r>
-            <w:proofErr w:type="spellEnd"/>
           </w:p>
         </w:tc>
         <w:tc>
@@ -1755,7 +1684,6 @@
                 <w:rFonts w:hint="eastAsia"/>
               </w:rPr>
             </w:pPr>
-            <w:proofErr w:type="spellStart"/>
             <w:r>
               <w:rPr>
                 <w:rFonts w:ascii="微软雅黑" w:eastAsia="微软雅黑" w:hAnsi="微软雅黑"/>
@@ -1765,7 +1693,6 @@
               </w:rPr>
               <w:t>处理方法</w:t>
             </w:r>
-            <w:proofErr w:type="spellEnd"/>
           </w:p>
         </w:tc>
         <w:tc>
@@ -1794,7 +1721,6 @@
                 <w:rFonts w:hint="eastAsia"/>
               </w:rPr>
             </w:pPr>
-            <w:proofErr w:type="spellStart"/>
             <w:r>
               <w:rPr>
                 <w:rFonts w:ascii="微软雅黑" w:eastAsia="微软雅黑" w:hAnsi="微软雅黑"/>
@@ -1804,7 +1730,6 @@
               </w:rPr>
               <w:t>产出</w:t>
             </w:r>
-            <w:proofErr w:type="spellEnd"/>
           </w:p>
         </w:tc>
       </w:tr>
@@ -1838,7 +1763,6 @@
                 <w:rFonts w:hint="eastAsia"/>
               </w:rPr>
             </w:pPr>
-            <w:proofErr w:type="spellStart"/>
             <w:r>
               <w:rPr>
                 <w:rFonts w:eastAsia="宋体"/>
@@ -1846,7 +1770,6 @@
               </w:rPr>
               <w:t>场景接入</w:t>
             </w:r>
-            <w:proofErr w:type="spellEnd"/>
           </w:p>
         </w:tc>
         <w:tc>
@@ -1873,53 +1796,12 @@
                 <w:rFonts w:hint="eastAsia"/>
               </w:rPr>
             </w:pPr>
-            <w:proofErr w:type="spellStart"/>
             <w:r>
               <w:rPr>
                 <w:rFonts w:eastAsia="宋体"/>
                 <w:sz w:val="17"/>
               </w:rPr>
-              <w:t>核查公开素材的格式、来源与使用条件；在</w:t>
-            </w:r>
-            <w:proofErr w:type="spellEnd"/>
-            <w:r>
-              <w:rPr>
-                <w:rFonts w:eastAsia="宋体"/>
-                <w:sz w:val="17"/>
-              </w:rPr>
-              <w:t xml:space="preserve"> Unity 6.3 LTS 与 URP </w:t>
-            </w:r>
-            <w:proofErr w:type="spellStart"/>
-            <w:r>
-              <w:rPr>
-                <w:rFonts w:eastAsia="宋体"/>
-                <w:sz w:val="17"/>
-              </w:rPr>
-              <w:t>中测试</w:t>
-            </w:r>
-            <w:proofErr w:type="spellEnd"/>
-            <w:r>
-              <w:rPr>
-                <w:rFonts w:eastAsia="宋体"/>
-                <w:sz w:val="17"/>
-              </w:rPr>
-              <w:t xml:space="preserve"> 3DGS </w:t>
-            </w:r>
-            <w:proofErr w:type="spellStart"/>
-            <w:r>
-              <w:rPr>
-                <w:rFonts w:eastAsia="宋体"/>
-                <w:sz w:val="17"/>
-              </w:rPr>
-              <w:t>渲染组件，校准坐标、尺度和场景范围</w:t>
-            </w:r>
-            <w:proofErr w:type="spellEnd"/>
-            <w:r>
-              <w:rPr>
-                <w:rFonts w:eastAsia="宋体"/>
-                <w:sz w:val="17"/>
-              </w:rPr>
-              <w:t>。</w:t>
+              <w:t>核查公开素材的格式、来源与使用条件；在 Unity 6.3 LTS 与 URP 中测试 3DGS 渲染组件，校准坐标、尺度和场景范围。</w:t>
             </w:r>
           </w:p>
         </w:tc>
@@ -1990,7 +1872,6 @@
                 <w:rFonts w:hint="eastAsia"/>
               </w:rPr>
             </w:pPr>
-            <w:proofErr w:type="spellStart"/>
             <w:r>
               <w:rPr>
                 <w:rFonts w:eastAsia="宋体"/>
@@ -1998,7 +1879,6 @@
               </w:rPr>
               <w:t>导览数据</w:t>
             </w:r>
-            <w:proofErr w:type="spellEnd"/>
           </w:p>
         </w:tc>
         <w:tc>
@@ -2104,7 +1984,6 @@
                 <w:rFonts w:hint="eastAsia"/>
               </w:rPr>
             </w:pPr>
-            <w:proofErr w:type="spellStart"/>
             <w:r>
               <w:rPr>
                 <w:rFonts w:eastAsia="宋体"/>
@@ -2112,7 +1991,6 @@
               </w:rPr>
               <w:t>可走路线</w:t>
             </w:r>
-            <w:proofErr w:type="spellEnd"/>
           </w:p>
         </w:tc>
         <w:tc>
@@ -2217,7 +2095,6 @@
                 <w:rFonts w:hint="eastAsia"/>
               </w:rPr>
             </w:pPr>
-            <w:proofErr w:type="spellStart"/>
             <w:r>
               <w:rPr>
                 <w:rFonts w:eastAsia="宋体"/>
@@ -2225,7 +2102,6 @@
               </w:rPr>
               <w:t>推荐与评价</w:t>
             </w:r>
-            <w:proofErr w:type="spellEnd"/>
           </w:p>
         </w:tc>
         <w:tc>
@@ -2336,17 +2212,8 @@
                 <w:rFonts w:eastAsia="宋体"/>
                 <w:sz w:val="17"/>
               </w:rPr>
-              <w:t xml:space="preserve">VR </w:t>
+              <w:t>VR 接入</w:t>
             </w:r>
-            <w:proofErr w:type="spellStart"/>
-            <w:r>
-              <w:rPr>
-                <w:rFonts w:eastAsia="宋体"/>
-                <w:sz w:val="17"/>
-              </w:rPr>
-              <w:t>接入</w:t>
-            </w:r>
-            <w:proofErr w:type="spellEnd"/>
           </w:p>
         </w:tc>
         <w:tc>
@@ -2373,53 +2240,12 @@
                 <w:rFonts w:hint="eastAsia"/>
               </w:rPr>
             </w:pPr>
-            <w:proofErr w:type="spellStart"/>
             <w:r>
               <w:rPr>
                 <w:rFonts w:eastAsia="宋体"/>
                 <w:sz w:val="17"/>
               </w:rPr>
-              <w:t>桌面端稳定后，使用</w:t>
-            </w:r>
-            <w:proofErr w:type="spellEnd"/>
-            <w:r>
-              <w:rPr>
-                <w:rFonts w:eastAsia="宋体"/>
-                <w:sz w:val="17"/>
-              </w:rPr>
-              <w:t xml:space="preserve"> </w:t>
-            </w:r>
-            <w:proofErr w:type="spellStart"/>
-            <w:r>
-              <w:rPr>
-                <w:rFonts w:eastAsia="宋体"/>
-                <w:sz w:val="17"/>
-              </w:rPr>
-              <w:t>OpenXR</w:t>
-            </w:r>
-            <w:proofErr w:type="spellEnd"/>
-            <w:r>
-              <w:rPr>
-                <w:rFonts w:eastAsia="宋体"/>
-                <w:sz w:val="17"/>
-              </w:rPr>
-              <w:t xml:space="preserve"> 与 XR Interaction Toolkit </w:t>
-            </w:r>
-            <w:proofErr w:type="spellStart"/>
-            <w:r>
-              <w:rPr>
-                <w:rFonts w:eastAsia="宋体"/>
-                <w:sz w:val="17"/>
-              </w:rPr>
-              <w:t>接入移动、景点选择和空间提示，并在实际设备上测量性能</w:t>
-            </w:r>
-            <w:proofErr w:type="spellEnd"/>
-            <w:r>
-              <w:rPr>
-                <w:rFonts w:eastAsia="宋体"/>
-                <w:sz w:val="17"/>
-              </w:rPr>
-              <w:t>。</w:t>
+              <w:t>桌面端稳定后，使用 OpenXR 与 XR Interaction Toolkit 接入移动、景点选择和空间提示，并在实际设备上测量性能。</w:t>
             </w:r>
           </w:p>
         </w:tc>
@@ -2479,11 +2305,19 @@
       </w:pPr>
       <w:r>
         <w:rPr>
+          <w:rFonts w:ascii="微软雅黑" w:eastAsia="微软雅黑" w:hAnsi="微软雅黑" w:hint="eastAsia"/>
+          <w:sz w:val="22"/>
+          <w:lang w:eastAsia="zh-CN"/>
+        </w:rPr>
+        <w:t>5</w:t>
+      </w:r>
+      <w:r>
+        <w:rPr>
           <w:rFonts w:ascii="微软雅黑" w:eastAsia="微软雅黑" w:hAnsi="微软雅黑"/>
           <w:sz w:val="22"/>
           <w:lang w:eastAsia="zh-CN"/>
         </w:rPr>
-        <w:t>4.2 导航与推荐方法</w:t>
+        <w:t>.2 导航与推荐方法</w:t>
       </w:r>
     </w:p>
     <w:p>
@@ -2499,23 +2333,7 @@
           <w:rFonts w:eastAsia="宋体"/>
           <w:lang w:eastAsia="zh-CN"/>
         </w:rPr>
-        <w:t xml:space="preserve">3DGS 负责画面，简化几何负责行走碰撞，路线图负责路径搜索，三者共享坐标。原型使用手工路网；素材有可靠网格时可用 </w:t>
-      </w:r>
-      <w:proofErr w:type="spellStart"/>
-      <w:r>
-        <w:rPr>
-          <w:rFonts w:eastAsia="宋体"/>
-          <w:lang w:eastAsia="zh-CN"/>
-        </w:rPr>
-        <w:t>NavMesh</w:t>
-      </w:r>
-      <w:proofErr w:type="spellEnd"/>
-      <w:r>
-        <w:rPr>
-          <w:rFonts w:eastAsia="宋体"/>
-          <w:lang w:eastAsia="zh-CN"/>
-        </w:rPr>
-        <w:t>。相机轨迹可辅助生成候选路点，但连边仍须按真实道路复核。</w:t>
+        <w:t>3DGS 负责画面，简化几何负责行走碰撞，路线图负责路径搜索，三者共享坐标。原型使用手工路网；素材有可靠网格时可用 NavMesh。相机轨迹可辅助生成候选路点，但连边仍须按真实道路复核。</w:t>
       </w:r>
     </w:p>
     <w:p>
@@ -2571,20 +2389,19 @@
       </w:pPr>
       <w:r>
         <w:rPr>
-          <w:rFonts w:ascii="微软雅黑" w:eastAsia="微软雅黑" w:hAnsi="微软雅黑"/>
+          <w:rFonts w:ascii="微软雅黑" w:eastAsia="微软雅黑" w:hAnsi="微软雅黑" w:hint="eastAsia"/>
           <w:sz w:val="22"/>
+          <w:lang w:eastAsia="zh-CN"/>
         </w:rPr>
-        <w:t xml:space="preserve">4.3 </w:t>
+        <w:t>5</w:t>
       </w:r>
-      <w:proofErr w:type="spellStart"/>
       <w:r>
         <w:rPr>
           <w:rFonts w:ascii="微软雅黑" w:eastAsia="微软雅黑" w:hAnsi="微软雅黑"/>
           <w:sz w:val="22"/>
         </w:rPr>
-        <w:t>数据接口与开发环境</w:t>
+        <w:t>.3 数据接口与开发环境</w:t>
       </w:r>
-      <w:proofErr w:type="spellEnd"/>
     </w:p>
     <w:tbl>
       <w:tblPr>
@@ -2628,7 +2445,6 @@
                 <w:rFonts w:hint="eastAsia"/>
               </w:rPr>
             </w:pPr>
-            <w:proofErr w:type="spellStart"/>
             <w:r>
               <w:rPr>
                 <w:rFonts w:ascii="微软雅黑" w:eastAsia="微软雅黑" w:hAnsi="微软雅黑"/>
@@ -2638,7 +2454,6 @@
               </w:rPr>
               <w:t>数据或工具</w:t>
             </w:r>
-            <w:proofErr w:type="spellEnd"/>
           </w:p>
         </w:tc>
         <w:tc>
@@ -2667,7 +2482,6 @@
                 <w:rFonts w:hint="eastAsia"/>
               </w:rPr>
             </w:pPr>
-            <w:proofErr w:type="spellStart"/>
             <w:r>
               <w:rPr>
                 <w:rFonts w:ascii="微软雅黑" w:eastAsia="微软雅黑" w:hAnsi="微软雅黑"/>
@@ -2677,7 +2491,6 @@
               </w:rPr>
               <w:t>统一约定</w:t>
             </w:r>
-            <w:proofErr w:type="spellEnd"/>
           </w:p>
         </w:tc>
       </w:tr>
@@ -2710,7 +2523,6 @@
                 <w:rFonts w:hint="eastAsia"/>
               </w:rPr>
             </w:pPr>
-            <w:proofErr w:type="spellStart"/>
             <w:r>
               <w:rPr>
                 <w:rFonts w:eastAsia="宋体"/>
@@ -2718,7 +2530,6 @@
               </w:rPr>
               <w:t>景点数据</w:t>
             </w:r>
-            <w:proofErr w:type="spellEnd"/>
           </w:p>
         </w:tc>
         <w:tc>
@@ -2787,7 +2598,6 @@
                 <w:rFonts w:hint="eastAsia"/>
               </w:rPr>
             </w:pPr>
-            <w:proofErr w:type="spellStart"/>
             <w:r>
               <w:rPr>
                 <w:rFonts w:eastAsia="宋体"/>
@@ -2796,7 +2606,6 @@
               <w:lastRenderedPageBreak/>
               <w:t>路线接口</w:t>
             </w:r>
-            <w:proofErr w:type="spellEnd"/>
           </w:p>
         </w:tc>
         <w:tc>
@@ -2865,7 +2674,6 @@
                 <w:rFonts w:hint="eastAsia"/>
               </w:rPr>
             </w:pPr>
-            <w:proofErr w:type="spellStart"/>
             <w:r>
               <w:rPr>
                 <w:rFonts w:eastAsia="宋体"/>
@@ -2873,7 +2681,6 @@
               </w:rPr>
               <w:t>浏览日志</w:t>
             </w:r>
-            <w:proofErr w:type="spellEnd"/>
           </w:p>
         </w:tc>
         <w:tc>
@@ -2901,85 +2708,12 @@
                 <w:lang w:eastAsia="zh-CN"/>
               </w:rPr>
             </w:pPr>
-            <w:proofErr w:type="spellStart"/>
             <w:r>
               <w:rPr>
                 <w:rFonts w:eastAsia="宋体"/>
                 <w:sz w:val="18"/>
               </w:rPr>
-              <w:t>统一使用</w:t>
-            </w:r>
-            <w:proofErr w:type="spellEnd"/>
-            <w:r>
-              <w:rPr>
-                <w:rFonts w:eastAsia="宋体"/>
-                <w:sz w:val="18"/>
-              </w:rPr>
-              <w:t xml:space="preserve"> UTF-8 </w:t>
-            </w:r>
-            <w:proofErr w:type="spellStart"/>
-            <w:r>
-              <w:rPr>
-                <w:rFonts w:eastAsia="宋体"/>
-                <w:sz w:val="18"/>
-              </w:rPr>
-              <w:t>JSONL，每行一条事件，保留</w:t>
-            </w:r>
-            <w:proofErr w:type="spellEnd"/>
-            <w:r>
-              <w:rPr>
-                <w:rFonts w:eastAsia="宋体"/>
-                <w:sz w:val="18"/>
-              </w:rPr>
-              <w:t xml:space="preserve"> </w:t>
-            </w:r>
-            <w:proofErr w:type="spellStart"/>
-            <w:r>
-              <w:rPr>
-                <w:rFonts w:eastAsia="宋体"/>
-                <w:sz w:val="18"/>
-              </w:rPr>
-              <w:t>schema_version、session_id、时间戳、事件类型、用户位置与相机姿态、目标景点</w:t>
-            </w:r>
-            <w:proofErr w:type="spellEnd"/>
-            <w:r>
-              <w:rPr>
-                <w:rFonts w:eastAsia="宋体"/>
-                <w:sz w:val="18"/>
-              </w:rPr>
-              <w:t xml:space="preserve"> </w:t>
-            </w:r>
-            <w:proofErr w:type="spellStart"/>
-            <w:r>
-              <w:rPr>
-                <w:rFonts w:eastAsia="宋体"/>
-                <w:sz w:val="18"/>
-              </w:rPr>
-              <w:t>ID、路线</w:t>
-            </w:r>
-            <w:proofErr w:type="spellEnd"/>
-            <w:r>
-              <w:rPr>
-                <w:rFonts w:eastAsia="宋体"/>
-                <w:sz w:val="18"/>
-              </w:rPr>
-              <w:t xml:space="preserve"> </w:t>
-            </w:r>
-            <w:proofErr w:type="spellStart"/>
-            <w:r>
-              <w:rPr>
-                <w:rFonts w:eastAsia="宋体"/>
-                <w:sz w:val="18"/>
-              </w:rPr>
-              <w:t>ID、路线长度、到达状态和场景配置</w:t>
-            </w:r>
-            <w:proofErr w:type="spellEnd"/>
-            <w:r>
-              <w:rPr>
-                <w:rFonts w:eastAsia="宋体"/>
-                <w:sz w:val="18"/>
-              </w:rPr>
-              <w:t xml:space="preserve"> ID。</w:t>
+              <w:t>统一使用 UTF-8 JSONL，每行一条事件，保留 schema_version、session_id、时间戳、事件类型、用户位置与相机姿态、目标景点 ID、路线 ID、路线长度、到达状态和场景配置 ID。</w:t>
             </w:r>
             <w:r>
               <w:rPr>
@@ -3022,7 +2756,6 @@
                 <w:rFonts w:hint="eastAsia"/>
               </w:rPr>
             </w:pPr>
-            <w:proofErr w:type="spellStart"/>
             <w:r>
               <w:rPr>
                 <w:rFonts w:eastAsia="宋体"/>
@@ -3030,7 +2763,6 @@
               </w:rPr>
               <w:t>环境版本</w:t>
             </w:r>
-            <w:proofErr w:type="spellEnd"/>
           </w:p>
         </w:tc>
         <w:tc>
@@ -3058,101 +2790,12 @@
                 <w:rFonts w:hint="eastAsia"/>
               </w:rPr>
             </w:pPr>
-            <w:proofErr w:type="spellStart"/>
             <w:r>
               <w:rPr>
                 <w:rFonts w:eastAsia="宋体"/>
                 <w:sz w:val="18"/>
               </w:rPr>
-              <w:t>统一</w:t>
-            </w:r>
-            <w:proofErr w:type="spellEnd"/>
-            <w:r>
-              <w:rPr>
-                <w:rFonts w:eastAsia="宋体"/>
-                <w:sz w:val="18"/>
-              </w:rPr>
-              <w:t xml:space="preserve"> Unity 6.3 LTS、C#、URP、3DGS </w:t>
-            </w:r>
-            <w:proofErr w:type="spellStart"/>
-            <w:r>
-              <w:rPr>
-                <w:rFonts w:eastAsia="宋体"/>
-                <w:sz w:val="18"/>
-              </w:rPr>
-              <w:t>组件版本；VR</w:t>
-            </w:r>
-            <w:proofErr w:type="spellEnd"/>
-            <w:r>
-              <w:rPr>
-                <w:rFonts w:eastAsia="宋体"/>
-                <w:sz w:val="18"/>
-              </w:rPr>
-              <w:t xml:space="preserve"> </w:t>
-            </w:r>
-            <w:proofErr w:type="spellStart"/>
-            <w:r>
-              <w:rPr>
-                <w:rFonts w:eastAsia="宋体"/>
-                <w:sz w:val="18"/>
-              </w:rPr>
-              <w:t>阶段使用</w:t>
-            </w:r>
-            <w:proofErr w:type="spellEnd"/>
-            <w:r>
-              <w:rPr>
-                <w:rFonts w:eastAsia="宋体"/>
-                <w:sz w:val="18"/>
-              </w:rPr>
-              <w:t xml:space="preserve"> </w:t>
-            </w:r>
-            <w:proofErr w:type="spellStart"/>
-            <w:r>
-              <w:rPr>
-                <w:rFonts w:eastAsia="宋体"/>
-                <w:sz w:val="18"/>
-              </w:rPr>
-              <w:t>OpenXR</w:t>
-            </w:r>
-            <w:proofErr w:type="spellEnd"/>
-            <w:r>
-              <w:rPr>
-                <w:rFonts w:eastAsia="宋体"/>
-                <w:sz w:val="18"/>
-              </w:rPr>
-              <w:t xml:space="preserve"> 和 XR Interaction </w:t>
-            </w:r>
-            <w:proofErr w:type="spellStart"/>
-            <w:r>
-              <w:rPr>
-                <w:rFonts w:eastAsia="宋体"/>
-                <w:sz w:val="18"/>
-              </w:rPr>
-              <w:t>Toolkit；使用</w:t>
-            </w:r>
-            <w:proofErr w:type="spellEnd"/>
-            <w:r>
-              <w:rPr>
-                <w:rFonts w:eastAsia="宋体"/>
-                <w:sz w:val="18"/>
-              </w:rPr>
-              <w:t xml:space="preserve"> Profiler </w:t>
-            </w:r>
-            <w:proofErr w:type="spellStart"/>
-            <w:r>
-              <w:rPr>
-                <w:rFonts w:eastAsia="宋体"/>
-                <w:sz w:val="18"/>
-              </w:rPr>
-              <w:t>实测性能</w:t>
-            </w:r>
-            <w:proofErr w:type="spellEnd"/>
-            <w:r>
-              <w:rPr>
-                <w:rFonts w:eastAsia="宋体"/>
-                <w:sz w:val="18"/>
-              </w:rPr>
-              <w:t>。</w:t>
+              <w:t>统一 Unity 6.3 LTS、C#、URP、3DGS 组件版本；VR 阶段使用 OpenXR 和 XR Interaction Toolkit；使用 Profiler 实测性能。</w:t>
             </w:r>
           </w:p>
         </w:tc>
@@ -3184,17 +2827,8 @@
           <w:rFonts w:ascii="微软雅黑" w:eastAsia="微软雅黑" w:hAnsi="微软雅黑"/>
           <w:sz w:val="26"/>
         </w:rPr>
-        <w:t xml:space="preserve"> </w:t>
+        <w:t xml:space="preserve"> 项目分工</w:t>
       </w:r>
-      <w:proofErr w:type="spellStart"/>
-      <w:r>
-        <w:rPr>
-          <w:rFonts w:ascii="微软雅黑" w:eastAsia="微软雅黑" w:hAnsi="微软雅黑"/>
-          <w:sz w:val="26"/>
-        </w:rPr>
-        <w:t>项目分工</w:t>
-      </w:r>
-      <w:proofErr w:type="spellEnd"/>
     </w:p>
     <w:tbl>
       <w:tblPr>
@@ -3238,7 +2872,6 @@
                 <w:rFonts w:hint="eastAsia"/>
               </w:rPr>
             </w:pPr>
-            <w:proofErr w:type="spellStart"/>
             <w:r>
               <w:rPr>
                 <w:rFonts w:ascii="微软雅黑" w:eastAsia="微软雅黑" w:hAnsi="微软雅黑"/>
@@ -3248,7 +2881,6 @@
               </w:rPr>
               <w:t>成员</w:t>
             </w:r>
-            <w:proofErr w:type="spellEnd"/>
           </w:p>
         </w:tc>
         <w:tc>
@@ -3277,7 +2909,6 @@
                 <w:rFonts w:hint="eastAsia"/>
               </w:rPr>
             </w:pPr>
-            <w:proofErr w:type="spellStart"/>
             <w:r>
               <w:rPr>
                 <w:rFonts w:ascii="微软雅黑" w:eastAsia="微软雅黑" w:hAnsi="微软雅黑"/>
@@ -3287,7 +2918,6 @@
               </w:rPr>
               <w:t>负责的工程工作</w:t>
             </w:r>
-            <w:proofErr w:type="spellEnd"/>
           </w:p>
         </w:tc>
       </w:tr>
@@ -3321,24 +2951,13 @@
                 <w:rFonts w:hint="eastAsia"/>
               </w:rPr>
             </w:pPr>
-            <w:proofErr w:type="gramStart"/>
             <w:r>
               <w:rPr>
                 <w:rFonts w:eastAsia="宋体"/>
                 <w:sz w:val="17"/>
               </w:rPr>
-              <w:t xml:space="preserve">A  </w:t>
+              <w:t>A  场景与运行</w:t>
             </w:r>
-            <w:proofErr w:type="spellStart"/>
-            <w:r>
-              <w:rPr>
-                <w:rFonts w:eastAsia="宋体"/>
-                <w:sz w:val="17"/>
-              </w:rPr>
-              <w:t>场景与运行</w:t>
-            </w:r>
-            <w:proofErr w:type="spellEnd"/>
-            <w:proofErr w:type="gramEnd"/>
           </w:p>
         </w:tc>
         <w:tc>
@@ -3408,24 +3027,13 @@
                 <w:rFonts w:hint="eastAsia"/>
               </w:rPr>
             </w:pPr>
-            <w:proofErr w:type="gramStart"/>
             <w:r>
               <w:rPr>
                 <w:rFonts w:eastAsia="宋体"/>
                 <w:sz w:val="17"/>
               </w:rPr>
-              <w:t xml:space="preserve">B  </w:t>
+              <w:t>B  景点与交互</w:t>
             </w:r>
-            <w:proofErr w:type="spellStart"/>
-            <w:r>
-              <w:rPr>
-                <w:rFonts w:eastAsia="宋体"/>
-                <w:sz w:val="17"/>
-              </w:rPr>
-              <w:t>景点与交互</w:t>
-            </w:r>
-            <w:proofErr w:type="spellEnd"/>
-            <w:proofErr w:type="gramEnd"/>
           </w:p>
         </w:tc>
         <w:tc>
@@ -3495,24 +3103,13 @@
                 <w:rFonts w:hint="eastAsia"/>
               </w:rPr>
             </w:pPr>
-            <w:proofErr w:type="gramStart"/>
             <w:r>
               <w:rPr>
                 <w:rFonts w:eastAsia="宋体"/>
                 <w:sz w:val="17"/>
               </w:rPr>
-              <w:t xml:space="preserve">C  </w:t>
+              <w:t>C  路线与研究</w:t>
             </w:r>
-            <w:proofErr w:type="spellStart"/>
-            <w:r>
-              <w:rPr>
-                <w:rFonts w:eastAsia="宋体"/>
-                <w:sz w:val="17"/>
-              </w:rPr>
-              <w:t>路线与研究</w:t>
-            </w:r>
-            <w:proofErr w:type="spellEnd"/>
-            <w:proofErr w:type="gramEnd"/>
           </w:p>
         </w:tc>
         <w:tc>
@@ -3637,7 +3234,6 @@
                 <w:rFonts w:hint="eastAsia"/>
               </w:rPr>
             </w:pPr>
-            <w:proofErr w:type="spellStart"/>
             <w:r>
               <w:rPr>
                 <w:rFonts w:ascii="微软雅黑" w:eastAsia="微软雅黑" w:hAnsi="微软雅黑"/>
@@ -3647,7 +3243,6 @@
               </w:rPr>
               <w:t>周次</w:t>
             </w:r>
-            <w:proofErr w:type="spellEnd"/>
           </w:p>
         </w:tc>
         <w:tc>
@@ -3676,7 +3271,6 @@
                 <w:rFonts w:hint="eastAsia"/>
               </w:rPr>
             </w:pPr>
-            <w:proofErr w:type="spellStart"/>
             <w:r>
               <w:rPr>
                 <w:rFonts w:ascii="微软雅黑" w:eastAsia="微软雅黑" w:hAnsi="微软雅黑"/>
@@ -3686,7 +3280,6 @@
               </w:rPr>
               <w:t>阶段与主要工作</w:t>
             </w:r>
-            <w:proofErr w:type="spellEnd"/>
           </w:p>
         </w:tc>
         <w:tc>
@@ -3715,7 +3308,6 @@
                 <w:rFonts w:hint="eastAsia"/>
               </w:rPr>
             </w:pPr>
-            <w:proofErr w:type="spellStart"/>
             <w:r>
               <w:rPr>
                 <w:rFonts w:ascii="微软雅黑" w:eastAsia="微软雅黑" w:hAnsi="微软雅黑"/>
@@ -3725,7 +3317,6 @@
               </w:rPr>
               <w:t>验收结果</w:t>
             </w:r>
-            <w:proofErr w:type="spellEnd"/>
           </w:p>
         </w:tc>
       </w:tr>
@@ -4653,17 +4244,8 @@
           <w:rFonts w:ascii="微软雅黑" w:eastAsia="微软雅黑" w:hAnsi="微软雅黑"/>
           <w:sz w:val="26"/>
         </w:rPr>
-        <w:t xml:space="preserve"> </w:t>
+        <w:t xml:space="preserve"> 参考</w:t>
       </w:r>
-      <w:proofErr w:type="spellStart"/>
-      <w:r>
-        <w:rPr>
-          <w:rFonts w:ascii="微软雅黑" w:eastAsia="微软雅黑" w:hAnsi="微软雅黑"/>
-          <w:sz w:val="26"/>
-        </w:rPr>
-        <w:t>参考</w:t>
-      </w:r>
-      <w:proofErr w:type="spellEnd"/>
     </w:p>
     <w:p>
       <w:pPr>
@@ -4690,21 +4272,7 @@
         <w:rPr>
           <w:rFonts w:eastAsia="宋体"/>
         </w:rPr>
-        <w:t xml:space="preserve">Shen Y, et al. </w:t>
-      </w:r>
-      <w:proofErr w:type="spellStart"/>
-      <w:r>
-        <w:rPr>
-          <w:rFonts w:eastAsia="宋体"/>
-        </w:rPr>
-        <w:t>GaussianShopVR</w:t>
-      </w:r>
-      <w:proofErr w:type="spellEnd"/>
-      <w:r>
-        <w:rPr>
-          <w:rFonts w:eastAsia="宋体"/>
-        </w:rPr>
-        <w:t>. ACM UIST, 2025.</w:t>
+        <w:t>Shen Y, et al. GaussianShopVR. ACM UIST, 2025.</w:t>
       </w:r>
     </w:p>
     <w:p>
@@ -4781,27 +4349,7 @@
         <w:sz w:val="17"/>
         <w:lang w:eastAsia="zh-CN"/>
       </w:rPr>
-      <w:t xml:space="preserve">民族建筑景区 3DGS </w:t>
-    </w:r>
-    <w:proofErr w:type="gramStart"/>
-    <w:r>
-      <w:rPr>
-        <w:rFonts w:eastAsia="宋体"/>
-        <w:color w:val="646464"/>
-        <w:sz w:val="17"/>
-        <w:lang w:eastAsia="zh-CN"/>
-      </w:rPr>
-      <w:t>项目计划书  ·</w:t>
-    </w:r>
-    <w:proofErr w:type="gramEnd"/>
-    <w:r>
-      <w:rPr>
-        <w:rFonts w:eastAsia="宋体"/>
-        <w:color w:val="646464"/>
-        <w:sz w:val="17"/>
-        <w:lang w:eastAsia="zh-CN"/>
-      </w:rPr>
-      <w:t xml:space="preserve">  第 </w:t>
+      <w:t xml:space="preserve">民族建筑景区 3DGS 项目计划书  ·  第 </w:t>
     </w:r>
     <w:r>
       <w:fldChar w:fldCharType="begin"/>
@@ -5913,6 +5461,7 @@
   <w:style w:type="character" w:default="1" w:styleId="a2">
     <w:name w:val="Default Paragraph Font"/>
     <w:uiPriority w:val="1"/>
+    <w:semiHidden/>
     <w:unhideWhenUsed/>
   </w:style>
   <w:style w:type="table" w:default="1" w:styleId="a3">

</xml_diff>